<commit_message>
Restart chapter 4 step numbering
</commit_message>
<xml_diff>
--- a/reports/BaoCao_TechStore_Final_KhongNhapHang.docx
+++ b/reports/BaoCao_TechStore_Final_KhongNhapHang.docx
@@ -4488,7 +4488,10 @@
     </w:p>
     <w:p>
       <w:pPr>
-        <w:pStyle w:val="ListNumber"/>
+        <w:numPr>
+          <w:ilvl w:val="0"/>
+          <w:numId w:val="10"/>
+        </w:numPr>
         <w:spacing w:after="60"/>
       </w:pPr>
       <w:r>
@@ -4503,7 +4506,10 @@
     </w:p>
     <w:p>
       <w:pPr>
-        <w:pStyle w:val="ListNumber"/>
+        <w:numPr>
+          <w:ilvl w:val="0"/>
+          <w:numId w:val="10"/>
+        </w:numPr>
         <w:spacing w:after="60"/>
       </w:pPr>
       <w:r>
@@ -4518,7 +4524,10 @@
     </w:p>
     <w:p>
       <w:pPr>
-        <w:pStyle w:val="ListNumber"/>
+        <w:numPr>
+          <w:ilvl w:val="0"/>
+          <w:numId w:val="10"/>
+        </w:numPr>
         <w:spacing w:after="60"/>
       </w:pPr>
       <w:r>
@@ -4533,7 +4542,10 @@
     </w:p>
     <w:p>
       <w:pPr>
-        <w:pStyle w:val="ListNumber"/>
+        <w:numPr>
+          <w:ilvl w:val="0"/>
+          <w:numId w:val="10"/>
+        </w:numPr>
         <w:spacing w:after="60"/>
       </w:pPr>
       <w:r>
@@ -4548,7 +4560,10 @@
     </w:p>
     <w:p>
       <w:pPr>
-        <w:pStyle w:val="ListNumber"/>
+        <w:numPr>
+          <w:ilvl w:val="0"/>
+          <w:numId w:val="10"/>
+        </w:numPr>
         <w:spacing w:after="60"/>
       </w:pPr>
       <w:r>
@@ -4628,7 +4643,10 @@
     </w:p>
     <w:p>
       <w:pPr>
-        <w:pStyle w:val="ListNumber"/>
+        <w:numPr>
+          <w:ilvl w:val="0"/>
+          <w:numId w:val="11"/>
+        </w:numPr>
         <w:spacing w:after="60"/>
       </w:pPr>
       <w:r>
@@ -4643,7 +4661,10 @@
     </w:p>
     <w:p>
       <w:pPr>
-        <w:pStyle w:val="ListNumber"/>
+        <w:numPr>
+          <w:ilvl w:val="0"/>
+          <w:numId w:val="11"/>
+        </w:numPr>
         <w:spacing w:after="60"/>
       </w:pPr>
       <w:r>
@@ -4658,7 +4679,10 @@
     </w:p>
     <w:p>
       <w:pPr>
-        <w:pStyle w:val="ListNumber"/>
+        <w:numPr>
+          <w:ilvl w:val="0"/>
+          <w:numId w:val="11"/>
+        </w:numPr>
         <w:spacing w:after="60"/>
       </w:pPr>
       <w:r>
@@ -4764,7 +4788,10 @@
     </w:p>
     <w:p>
       <w:pPr>
-        <w:pStyle w:val="ListNumber"/>
+        <w:numPr>
+          <w:ilvl w:val="0"/>
+          <w:numId w:val="12"/>
+        </w:numPr>
         <w:spacing w:after="60"/>
       </w:pPr>
       <w:r>
@@ -4779,7 +4806,10 @@
     </w:p>
     <w:p>
       <w:pPr>
-        <w:pStyle w:val="ListNumber"/>
+        <w:numPr>
+          <w:ilvl w:val="0"/>
+          <w:numId w:val="12"/>
+        </w:numPr>
         <w:spacing w:after="60"/>
       </w:pPr>
       <w:r>
@@ -4794,7 +4824,10 @@
     </w:p>
     <w:p>
       <w:pPr>
-        <w:pStyle w:val="ListNumber"/>
+        <w:numPr>
+          <w:ilvl w:val="0"/>
+          <w:numId w:val="12"/>
+        </w:numPr>
         <w:spacing w:after="60"/>
       </w:pPr>
       <w:r>
@@ -4900,7 +4933,10 @@
     </w:p>
     <w:p>
       <w:pPr>
-        <w:pStyle w:val="ListNumber"/>
+        <w:numPr>
+          <w:ilvl w:val="0"/>
+          <w:numId w:val="13"/>
+        </w:numPr>
         <w:spacing w:after="60"/>
       </w:pPr>
       <w:r>
@@ -4915,7 +4951,10 @@
     </w:p>
     <w:p>
       <w:pPr>
-        <w:pStyle w:val="ListNumber"/>
+        <w:numPr>
+          <w:ilvl w:val="0"/>
+          <w:numId w:val="13"/>
+        </w:numPr>
         <w:spacing w:after="60"/>
       </w:pPr>
       <w:r>
@@ -4930,7 +4969,10 @@
     </w:p>
     <w:p>
       <w:pPr>
-        <w:pStyle w:val="ListNumber"/>
+        <w:numPr>
+          <w:ilvl w:val="0"/>
+          <w:numId w:val="13"/>
+        </w:numPr>
         <w:spacing w:after="60"/>
       </w:pPr>
       <w:r>
@@ -5016,7 +5058,7 @@
           <w:color w:val="1F4D78"/>
           <w:sz w:val="26"/>
         </w:rPr>
-        <w:t>4.4. Thêm sản phẩm</w:t>
+        <w:t>4.4. Sửa sản phẩm</w:t>
       </w:r>
     </w:p>
     <w:p>
@@ -5031,12 +5073,15 @@
           <w:i w:val="0"/>
           <w:sz w:val="22"/>
         </w:rPr>
-        <w:t>Form thêm sản phẩm mới cho phép nhập mã sản phẩm, tên, hãng sản xuất, giá bán, số lượng và loại sản phẩm.</w:t>
-      </w:r>
-    </w:p>
-    <w:p>
-      <w:pPr>
-        <w:pStyle w:val="ListNumber"/>
+        <w:t>Chức năng sửa sản phẩm dùng lại form sản phẩm nhưng khóa mã sản phẩm vì đây là khóa định danh.</w:t>
+      </w:r>
+    </w:p>
+    <w:p>
+      <w:pPr>
+        <w:numPr>
+          <w:ilvl w:val="0"/>
+          <w:numId w:val="14"/>
+        </w:numPr>
         <w:spacing w:after="60"/>
       </w:pPr>
       <w:r>
@@ -5046,12 +5091,15 @@
           <w:i w:val="0"/>
           <w:sz w:val="22"/>
         </w:rPr>
-        <w:t>Nhấn nút Thêm Sản Phẩm Mới.</w:t>
-      </w:r>
-    </w:p>
-    <w:p>
-      <w:pPr>
-        <w:pStyle w:val="ListNumber"/>
+        <w:t>Chọn một sản phẩm trong bảng.</w:t>
+      </w:r>
+    </w:p>
+    <w:p>
+      <w:pPr>
+        <w:numPr>
+          <w:ilvl w:val="0"/>
+          <w:numId w:val="14"/>
+        </w:numPr>
         <w:spacing w:after="60"/>
       </w:pPr>
       <w:r>
@@ -5061,12 +5109,15 @@
           <w:i w:val="0"/>
           <w:sz w:val="22"/>
         </w:rPr>
-        <w:t>Nhập đầy đủ các trường bắt buộc.</w:t>
-      </w:r>
-    </w:p>
-    <w:p>
-      <w:pPr>
-        <w:pStyle w:val="ListNumber"/>
+        <w:t>Mở menu thao tác và chọn Sửa.</w:t>
+      </w:r>
+    </w:p>
+    <w:p>
+      <w:pPr>
+        <w:numPr>
+          <w:ilvl w:val="0"/>
+          <w:numId w:val="14"/>
+        </w:numPr>
         <w:spacing w:after="60"/>
       </w:pPr>
       <w:r>
@@ -5076,7 +5127,25 @@
           <w:i w:val="0"/>
           <w:sz w:val="22"/>
         </w:rPr>
-        <w:t>Nhấn Lưu để thêm sản phẩm.</w:t>
+        <w:t>Cập nhật tên, hãng, giá bán hoặc số lượng.</w:t>
+      </w:r>
+    </w:p>
+    <w:p>
+      <w:pPr>
+        <w:numPr>
+          <w:ilvl w:val="0"/>
+          <w:numId w:val="14"/>
+        </w:numPr>
+        <w:spacing w:after="60"/>
+      </w:pPr>
+      <w:r>
+        <w:rPr>
+          <w:rFonts w:ascii="Arial" w:hAnsi="Arial" w:eastAsia="Arial"/>
+          <w:b w:val="0"/>
+          <w:i w:val="0"/>
+          <w:sz w:val="22"/>
+        </w:rPr>
+        <w:t>Nhấn Lưu để cập nhật dữ liệu.</w:t>
       </w:r>
     </w:p>
     <w:p>
@@ -5096,7 +5165,7 @@
               <a:graphicData uri="http://schemas.openxmlformats.org/drawingml/2006/picture">
                 <pic:pic>
                   <pic:nvPicPr>
-                    <pic:cNvPr id="0" name="04_san_pham_them_moi.png"/>
+                    <pic:cNvPr id="0" name="05_san_pham_sua.png"/>
                     <pic:cNvPicPr/>
                   </pic:nvPicPr>
                   <pic:blipFill>
@@ -5132,7 +5201,7 @@
           <w:color w:val="374151"/>
           <w:sz w:val="20"/>
         </w:rPr>
-        <w:t>Hình 4.4. Form thêm sản phẩm mới</w:t>
+        <w:t>Hình 4.4. Form sửa thông tin sản phẩm</w:t>
       </w:r>
     </w:p>
     <w:p>
@@ -5152,158 +5221,7 @@
           <w:color w:val="1F4D78"/>
           <w:sz w:val="26"/>
         </w:rPr>
-        <w:t>4.5. Sửa sản phẩm</w:t>
-      </w:r>
-    </w:p>
-    <w:p>
-      <w:pPr>
-        <w:spacing w:line="300" w:lineRule="auto" w:after="120"/>
-        <w:jc w:val="both"/>
-      </w:pPr>
-      <w:r>
-        <w:rPr>
-          <w:rFonts w:ascii="Arial" w:hAnsi="Arial" w:eastAsia="Arial"/>
-          <w:b w:val="0"/>
-          <w:i w:val="0"/>
-          <w:sz w:val="22"/>
-        </w:rPr>
-        <w:t>Chức năng sửa sản phẩm dùng lại form sản phẩm nhưng khóa mã sản phẩm vì đây là khóa định danh.</w:t>
-      </w:r>
-    </w:p>
-    <w:p>
-      <w:pPr>
-        <w:pStyle w:val="ListNumber"/>
-        <w:spacing w:after="60"/>
-      </w:pPr>
-      <w:r>
-        <w:rPr>
-          <w:rFonts w:ascii="Arial" w:hAnsi="Arial" w:eastAsia="Arial"/>
-          <w:b w:val="0"/>
-          <w:i w:val="0"/>
-          <w:sz w:val="22"/>
-        </w:rPr>
-        <w:t>Chọn một sản phẩm trong bảng.</w:t>
-      </w:r>
-    </w:p>
-    <w:p>
-      <w:pPr>
-        <w:pStyle w:val="ListNumber"/>
-        <w:spacing w:after="60"/>
-      </w:pPr>
-      <w:r>
-        <w:rPr>
-          <w:rFonts w:ascii="Arial" w:hAnsi="Arial" w:eastAsia="Arial"/>
-          <w:b w:val="0"/>
-          <w:i w:val="0"/>
-          <w:sz w:val="22"/>
-        </w:rPr>
-        <w:t>Mở menu thao tác và chọn Sửa.</w:t>
-      </w:r>
-    </w:p>
-    <w:p>
-      <w:pPr>
-        <w:pStyle w:val="ListNumber"/>
-        <w:spacing w:after="60"/>
-      </w:pPr>
-      <w:r>
-        <w:rPr>
-          <w:rFonts w:ascii="Arial" w:hAnsi="Arial" w:eastAsia="Arial"/>
-          <w:b w:val="0"/>
-          <w:i w:val="0"/>
-          <w:sz w:val="22"/>
-        </w:rPr>
-        <w:t>Cập nhật tên, hãng, giá bán hoặc số lượng.</w:t>
-      </w:r>
-    </w:p>
-    <w:p>
-      <w:pPr>
-        <w:pStyle w:val="ListNumber"/>
-        <w:spacing w:after="60"/>
-      </w:pPr>
-      <w:r>
-        <w:rPr>
-          <w:rFonts w:ascii="Arial" w:hAnsi="Arial" w:eastAsia="Arial"/>
-          <w:b w:val="0"/>
-          <w:i w:val="0"/>
-          <w:sz w:val="22"/>
-        </w:rPr>
-        <w:t>Nhấn Lưu để cập nhật dữ liệu.</w:t>
-      </w:r>
-    </w:p>
-    <w:p>
-      <w:pPr>
-        <w:keepNext/>
-        <w:jc w:val="center"/>
-      </w:pPr>
-      <w:r>
-        <w:drawing>
-          <wp:inline xmlns:a="http://schemas.openxmlformats.org/drawingml/2006/main" xmlns:pic="http://schemas.openxmlformats.org/drawingml/2006/picture">
-            <wp:extent cx="5989320" cy="5133703"/>
-            <wp:docPr id="5" name="Picture 5"/>
-            <wp:cNvGraphicFramePr>
-              <a:graphicFrameLocks noChangeAspect="1"/>
-            </wp:cNvGraphicFramePr>
-            <a:graphic>
-              <a:graphicData uri="http://schemas.openxmlformats.org/drawingml/2006/picture">
-                <pic:pic>
-                  <pic:nvPicPr>
-                    <pic:cNvPr id="0" name="05_san_pham_sua.png"/>
-                    <pic:cNvPicPr/>
-                  </pic:nvPicPr>
-                  <pic:blipFill>
-                    <a:blip r:embed="rId13"/>
-                    <a:stretch>
-                      <a:fillRect/>
-                    </a:stretch>
-                  </pic:blipFill>
-                  <pic:spPr>
-                    <a:xfrm>
-                      <a:off x="0" y="0"/>
-                      <a:ext cx="5989320" cy="5133703"/>
-                    </a:xfrm>
-                    <a:prstGeom prst="rect"/>
-                  </pic:spPr>
-                </pic:pic>
-              </a:graphicData>
-            </a:graphic>
-          </wp:inline>
-        </w:drawing>
-      </w:r>
-    </w:p>
-    <w:p>
-      <w:pPr>
-        <w:spacing w:before="40" w:after="160"/>
-        <w:jc w:val="center"/>
-      </w:pPr>
-      <w:r>
-        <w:rPr>
-          <w:rFonts w:ascii="Arial" w:hAnsi="Arial" w:eastAsia="Arial"/>
-          <w:b w:val="0"/>
-          <w:i/>
-          <w:color w:val="374151"/>
-          <w:sz w:val="20"/>
-        </w:rPr>
-        <w:t>Hình 4.5. Form sửa thông tin sản phẩm</w:t>
-      </w:r>
-    </w:p>
-    <w:p>
-      <w:r>
-        <w:br w:type="page"/>
-      </w:r>
-    </w:p>
-    <w:p>
-      <w:pPr>
-        <w:pStyle w:val="Heading2"/>
-      </w:pPr>
-      <w:r>
-        <w:rPr>
-          <w:rFonts w:ascii="Arial" w:hAnsi="Arial" w:eastAsia="Arial"/>
-          <w:b/>
-          <w:i w:val="0"/>
-          <w:color w:val="1F4D78"/>
-          <w:sz w:val="26"/>
-        </w:rPr>
-        <w:t>4.6. Xóa sản phẩm</w:t>
+        <w:t>4.5. Xóa sản phẩm</w:t>
       </w:r>
     </w:p>
     <w:p>
@@ -5323,7 +5241,10 @@
     </w:p>
     <w:p>
       <w:pPr>
-        <w:pStyle w:val="ListNumber"/>
+        <w:numPr>
+          <w:ilvl w:val="0"/>
+          <w:numId w:val="15"/>
+        </w:numPr>
         <w:spacing w:after="60"/>
       </w:pPr>
       <w:r>
@@ -5338,7 +5259,10 @@
     </w:p>
     <w:p>
       <w:pPr>
-        <w:pStyle w:val="ListNumber"/>
+        <w:numPr>
+          <w:ilvl w:val="0"/>
+          <w:numId w:val="15"/>
+        </w:numPr>
         <w:spacing w:after="60"/>
       </w:pPr>
       <w:r>
@@ -5353,7 +5277,10 @@
     </w:p>
     <w:p>
       <w:pPr>
-        <w:pStyle w:val="ListNumber"/>
+        <w:numPr>
+          <w:ilvl w:val="0"/>
+          <w:numId w:val="15"/>
+        </w:numPr>
         <w:spacing w:after="60"/>
       </w:pPr>
       <w:r>
@@ -5368,7 +5295,10 @@
     </w:p>
     <w:p>
       <w:pPr>
-        <w:pStyle w:val="ListNumber"/>
+        <w:numPr>
+          <w:ilvl w:val="0"/>
+          <w:numId w:val="15"/>
+        </w:numPr>
         <w:spacing w:after="60"/>
       </w:pPr>
       <w:r>
@@ -5390,7 +5320,7 @@
         <w:drawing>
           <wp:inline xmlns:a="http://schemas.openxmlformats.org/drawingml/2006/main" xmlns:pic="http://schemas.openxmlformats.org/drawingml/2006/picture">
             <wp:extent cx="5989320" cy="3580650"/>
-            <wp:docPr id="6" name="Picture 6"/>
+            <wp:docPr id="5" name="Picture 5"/>
             <wp:cNvGraphicFramePr>
               <a:graphicFrameLocks noChangeAspect="1"/>
             </wp:cNvGraphicFramePr>
@@ -5402,7 +5332,7 @@
                     <pic:cNvPicPr/>
                   </pic:nvPicPr>
                   <pic:blipFill>
-                    <a:blip r:embed="rId14"/>
+                    <a:blip r:embed="rId13"/>
                     <a:stretch>
                       <a:fillRect/>
                     </a:stretch>
@@ -5434,7 +5364,7 @@
           <w:color w:val="374151"/>
           <w:sz w:val="20"/>
         </w:rPr>
-        <w:t>Hình 4.6. Hộp thoại xác nhận xóa sản phẩm</w:t>
+        <w:t>Hình 4.5. Hộp thoại xác nhận xóa sản phẩm</w:t>
       </w:r>
     </w:p>
     <w:p>
@@ -5454,7 +5384,7 @@
           <w:color w:val="1F4D78"/>
           <w:sz w:val="26"/>
         </w:rPr>
-        <w:t>4.7. Menu thao tác sản phẩm</w:t>
+        <w:t>4.6. Menu thao tác sản phẩm</w:t>
       </w:r>
     </w:p>
     <w:p>
@@ -5474,7 +5404,10 @@
     </w:p>
     <w:p>
       <w:pPr>
-        <w:pStyle w:val="ListNumber"/>
+        <w:numPr>
+          <w:ilvl w:val="0"/>
+          <w:numId w:val="16"/>
+        </w:numPr>
         <w:spacing w:after="60"/>
       </w:pPr>
       <w:r>
@@ -5489,7 +5422,10 @@
     </w:p>
     <w:p>
       <w:pPr>
-        <w:pStyle w:val="ListNumber"/>
+        <w:numPr>
+          <w:ilvl w:val="0"/>
+          <w:numId w:val="16"/>
+        </w:numPr>
         <w:spacing w:after="60"/>
       </w:pPr>
       <w:r>
@@ -5504,7 +5440,10 @@
     </w:p>
     <w:p>
       <w:pPr>
-        <w:pStyle w:val="ListNumber"/>
+        <w:numPr>
+          <w:ilvl w:val="0"/>
+          <w:numId w:val="16"/>
+        </w:numPr>
         <w:spacing w:after="60"/>
       </w:pPr>
       <w:r>
@@ -5526,7 +5465,7 @@
         <w:drawing>
           <wp:inline xmlns:a="http://schemas.openxmlformats.org/drawingml/2006/main" xmlns:pic="http://schemas.openxmlformats.org/drawingml/2006/picture">
             <wp:extent cx="5989320" cy="3327400"/>
-            <wp:docPr id="7" name="Picture 7"/>
+            <wp:docPr id="6" name="Picture 6"/>
             <wp:cNvGraphicFramePr>
               <a:graphicFrameLocks noChangeAspect="1"/>
             </wp:cNvGraphicFramePr>
@@ -5538,7 +5477,7 @@
                     <pic:cNvPicPr/>
                   </pic:nvPicPr>
                   <pic:blipFill>
-                    <a:blip r:embed="rId15"/>
+                    <a:blip r:embed="rId14"/>
                     <a:stretch>
                       <a:fillRect/>
                     </a:stretch>
@@ -5570,7 +5509,7 @@
           <w:color w:val="374151"/>
           <w:sz w:val="20"/>
         </w:rPr>
-        <w:t>Hình 4.7. Menu thao tác trong màn hình sản phẩm</w:t>
+        <w:t>Hình 4.6. Menu thao tác trong màn hình sản phẩm</w:t>
       </w:r>
     </w:p>
     <w:p>
@@ -5590,7 +5529,7 @@
           <w:color w:val="1F4D78"/>
           <w:sz w:val="26"/>
         </w:rPr>
-        <w:t>4.8. Danh sách hóa đơn</w:t>
+        <w:t>4.7. Danh sách hóa đơn</w:t>
       </w:r>
     </w:p>
     <w:p>
@@ -5610,7 +5549,10 @@
     </w:p>
     <w:p>
       <w:pPr>
-        <w:pStyle w:val="ListNumber"/>
+        <w:numPr>
+          <w:ilvl w:val="0"/>
+          <w:numId w:val="17"/>
+        </w:numPr>
         <w:spacing w:after="60"/>
       </w:pPr>
       <w:r>
@@ -5625,7 +5567,10 @@
     </w:p>
     <w:p>
       <w:pPr>
-        <w:pStyle w:val="ListNumber"/>
+        <w:numPr>
+          <w:ilvl w:val="0"/>
+          <w:numId w:val="17"/>
+        </w:numPr>
         <w:spacing w:after="60"/>
       </w:pPr>
       <w:r>
@@ -5640,7 +5585,10 @@
     </w:p>
     <w:p>
       <w:pPr>
-        <w:pStyle w:val="ListNumber"/>
+        <w:numPr>
+          <w:ilvl w:val="0"/>
+          <w:numId w:val="17"/>
+        </w:numPr>
         <w:spacing w:after="60"/>
       </w:pPr>
       <w:r>
@@ -5662,7 +5610,7 @@
         <w:drawing>
           <wp:inline xmlns:a="http://schemas.openxmlformats.org/drawingml/2006/main" xmlns:pic="http://schemas.openxmlformats.org/drawingml/2006/picture">
             <wp:extent cx="5989320" cy="3743325"/>
-            <wp:docPr id="8" name="Picture 8"/>
+            <wp:docPr id="7" name="Picture 7"/>
             <wp:cNvGraphicFramePr>
               <a:graphicFrameLocks noChangeAspect="1"/>
             </wp:cNvGraphicFramePr>
@@ -5674,7 +5622,7 @@
                     <pic:cNvPicPr/>
                   </pic:nvPicPr>
                   <pic:blipFill>
-                    <a:blip r:embed="rId16"/>
+                    <a:blip r:embed="rId15"/>
                     <a:stretch>
                       <a:fillRect/>
                     </a:stretch>
@@ -5706,7 +5654,7 @@
           <w:color w:val="374151"/>
           <w:sz w:val="20"/>
         </w:rPr>
-        <w:t>Hình 4.8. Danh sách hóa đơn</w:t>
+        <w:t>Hình 4.7. Danh sách hóa đơn</w:t>
       </w:r>
     </w:p>
     <w:p>
@@ -5726,7 +5674,7 @@
           <w:color w:val="1F4D78"/>
           <w:sz w:val="26"/>
         </w:rPr>
-        <w:t>4.9. Tạo hóa đơn bán hàng</w:t>
+        <w:t>4.8. Tạo hóa đơn bán hàng</w:t>
       </w:r>
     </w:p>
     <w:p>
@@ -5746,7 +5694,10 @@
     </w:p>
     <w:p>
       <w:pPr>
-        <w:pStyle w:val="ListNumber"/>
+        <w:numPr>
+          <w:ilvl w:val="0"/>
+          <w:numId w:val="18"/>
+        </w:numPr>
         <w:spacing w:after="60"/>
       </w:pPr>
       <w:r>
@@ -5761,7 +5712,10 @@
     </w:p>
     <w:p>
       <w:pPr>
-        <w:pStyle w:val="ListNumber"/>
+        <w:numPr>
+          <w:ilvl w:val="0"/>
+          <w:numId w:val="18"/>
+        </w:numPr>
         <w:spacing w:after="60"/>
       </w:pPr>
       <w:r>
@@ -5776,7 +5730,10 @@
     </w:p>
     <w:p>
       <w:pPr>
-        <w:pStyle w:val="ListNumber"/>
+        <w:numPr>
+          <w:ilvl w:val="0"/>
+          <w:numId w:val="18"/>
+        </w:numPr>
         <w:spacing w:after="60"/>
       </w:pPr>
       <w:r>
@@ -5791,7 +5748,10 @@
     </w:p>
     <w:p>
       <w:pPr>
-        <w:pStyle w:val="ListNumber"/>
+        <w:numPr>
+          <w:ilvl w:val="0"/>
+          <w:numId w:val="18"/>
+        </w:numPr>
         <w:spacing w:after="60"/>
       </w:pPr>
       <w:r>
@@ -5813,7 +5773,7 @@
         <w:drawing>
           <wp:inline xmlns:a="http://schemas.openxmlformats.org/drawingml/2006/main" xmlns:pic="http://schemas.openxmlformats.org/drawingml/2006/picture">
             <wp:extent cx="5989320" cy="4392555"/>
-            <wp:docPr id="9" name="Picture 9"/>
+            <wp:docPr id="8" name="Picture 8"/>
             <wp:cNvGraphicFramePr>
               <a:graphicFrameLocks noChangeAspect="1"/>
             </wp:cNvGraphicFramePr>
@@ -5825,7 +5785,7 @@
                     <pic:cNvPicPr/>
                   </pic:nvPicPr>
                   <pic:blipFill>
-                    <a:blip r:embed="rId17"/>
+                    <a:blip r:embed="rId16"/>
                     <a:stretch>
                       <a:fillRect/>
                     </a:stretch>
@@ -5857,7 +5817,7 @@
           <w:color w:val="374151"/>
           <w:sz w:val="20"/>
         </w:rPr>
-        <w:t>Hình 4.9. Form tạo hóa đơn bán hàng</w:t>
+        <w:t>Hình 4.8. Form tạo hóa đơn bán hàng</w:t>
       </w:r>
     </w:p>
     <w:p>
@@ -5877,7 +5837,7 @@
           <w:color w:val="1F4D78"/>
           <w:sz w:val="26"/>
         </w:rPr>
-        <w:t>4.10. Chọn sản phẩm cho hóa đơn</w:t>
+        <w:t>4.9. Chọn sản phẩm cho hóa đơn</w:t>
       </w:r>
     </w:p>
     <w:p>
@@ -5897,7 +5857,10 @@
     </w:p>
     <w:p>
       <w:pPr>
-        <w:pStyle w:val="ListNumber"/>
+        <w:numPr>
+          <w:ilvl w:val="0"/>
+          <w:numId w:val="19"/>
+        </w:numPr>
         <w:spacing w:after="60"/>
       </w:pPr>
       <w:r>
@@ -5912,7 +5875,10 @@
     </w:p>
     <w:p>
       <w:pPr>
-        <w:pStyle w:val="ListNumber"/>
+        <w:numPr>
+          <w:ilvl w:val="0"/>
+          <w:numId w:val="19"/>
+        </w:numPr>
         <w:spacing w:after="60"/>
       </w:pPr>
       <w:r>
@@ -5927,7 +5893,10 @@
     </w:p>
     <w:p>
       <w:pPr>
-        <w:pStyle w:val="ListNumber"/>
+        <w:numPr>
+          <w:ilvl w:val="0"/>
+          <w:numId w:val="19"/>
+        </w:numPr>
         <w:spacing w:after="60"/>
       </w:pPr>
       <w:r>
@@ -5942,7 +5911,10 @@
     </w:p>
     <w:p>
       <w:pPr>
-        <w:pStyle w:val="ListNumber"/>
+        <w:numPr>
+          <w:ilvl w:val="0"/>
+          <w:numId w:val="19"/>
+        </w:numPr>
         <w:spacing w:after="60"/>
       </w:pPr>
       <w:r>
@@ -5953,6 +5925,151 @@
           <w:sz w:val="22"/>
         </w:rPr>
         <w:t>Nhập số lượng muốn mua.</w:t>
+      </w:r>
+    </w:p>
+    <w:p>
+      <w:pPr>
+        <w:keepNext/>
+        <w:jc w:val="center"/>
+      </w:pPr>
+      <w:r>
+        <w:drawing>
+          <wp:inline xmlns:a="http://schemas.openxmlformats.org/drawingml/2006/main" xmlns:pic="http://schemas.openxmlformats.org/drawingml/2006/picture">
+            <wp:extent cx="5989320" cy="3851833"/>
+            <wp:docPr id="9" name="Picture 9"/>
+            <wp:cNvGraphicFramePr>
+              <a:graphicFrameLocks noChangeAspect="1"/>
+            </wp:cNvGraphicFramePr>
+            <a:graphic>
+              <a:graphicData uri="http://schemas.openxmlformats.org/drawingml/2006/picture">
+                <pic:pic>
+                  <pic:nvPicPr>
+                    <pic:cNvPr id="0" name="10_hoa_don_chon_san_pham.png"/>
+                    <pic:cNvPicPr/>
+                  </pic:nvPicPr>
+                  <pic:blipFill>
+                    <a:blip r:embed="rId17"/>
+                    <a:stretch>
+                      <a:fillRect/>
+                    </a:stretch>
+                  </pic:blipFill>
+                  <pic:spPr>
+                    <a:xfrm>
+                      <a:off x="0" y="0"/>
+                      <a:ext cx="5989320" cy="3851833"/>
+                    </a:xfrm>
+                    <a:prstGeom prst="rect"/>
+                  </pic:spPr>
+                </pic:pic>
+              </a:graphicData>
+            </a:graphic>
+          </wp:inline>
+        </w:drawing>
+      </w:r>
+    </w:p>
+    <w:p>
+      <w:pPr>
+        <w:spacing w:before="40" w:after="160"/>
+        <w:jc w:val="center"/>
+      </w:pPr>
+      <w:r>
+        <w:rPr>
+          <w:rFonts w:ascii="Arial" w:hAnsi="Arial" w:eastAsia="Arial"/>
+          <w:b w:val="0"/>
+          <w:i/>
+          <w:color w:val="374151"/>
+          <w:sz w:val="20"/>
+        </w:rPr>
+        <w:t>Hình 4.9. Dialog tìm kiếm và chọn sản phẩm</w:t>
+      </w:r>
+    </w:p>
+    <w:p>
+      <w:r>
+        <w:br w:type="page"/>
+      </w:r>
+    </w:p>
+    <w:p>
+      <w:pPr>
+        <w:pStyle w:val="Heading2"/>
+      </w:pPr>
+      <w:r>
+        <w:rPr>
+          <w:rFonts w:ascii="Arial" w:hAnsi="Arial" w:eastAsia="Arial"/>
+          <w:b/>
+          <w:i w:val="0"/>
+          <w:color w:val="1F4D78"/>
+          <w:sz w:val="26"/>
+        </w:rPr>
+        <w:t>4.10. Xem chi tiết hóa đơn</w:t>
+      </w:r>
+    </w:p>
+    <w:p>
+      <w:pPr>
+        <w:spacing w:line="300" w:lineRule="auto" w:after="120"/>
+        <w:jc w:val="both"/>
+      </w:pPr>
+      <w:r>
+        <w:rPr>
+          <w:rFonts w:ascii="Arial" w:hAnsi="Arial" w:eastAsia="Arial"/>
+          <w:b w:val="0"/>
+          <w:i w:val="0"/>
+          <w:sz w:val="22"/>
+        </w:rPr>
+        <w:t>Chi tiết hóa đơn hiển thị thông tin khách hàng, ngày tạo, danh sách sản phẩm, số lượng, đơn giá, thành tiền và tổng tiền.</w:t>
+      </w:r>
+    </w:p>
+    <w:p>
+      <w:pPr>
+        <w:numPr>
+          <w:ilvl w:val="0"/>
+          <w:numId w:val="20"/>
+        </w:numPr>
+        <w:spacing w:after="60"/>
+      </w:pPr>
+      <w:r>
+        <w:rPr>
+          <w:rFonts w:ascii="Arial" w:hAnsi="Arial" w:eastAsia="Arial"/>
+          <w:b w:val="0"/>
+          <w:i w:val="0"/>
+          <w:sz w:val="22"/>
+        </w:rPr>
+        <w:t>Chọn hóa đơn trong danh sách.</w:t>
+      </w:r>
+    </w:p>
+    <w:p>
+      <w:pPr>
+        <w:numPr>
+          <w:ilvl w:val="0"/>
+          <w:numId w:val="20"/>
+        </w:numPr>
+        <w:spacing w:after="60"/>
+      </w:pPr>
+      <w:r>
+        <w:rPr>
+          <w:rFonts w:ascii="Arial" w:hAnsi="Arial" w:eastAsia="Arial"/>
+          <w:b w:val="0"/>
+          <w:i w:val="0"/>
+          <w:sz w:val="22"/>
+        </w:rPr>
+        <w:t>Mở menu thao tác.</w:t>
+      </w:r>
+    </w:p>
+    <w:p>
+      <w:pPr>
+        <w:numPr>
+          <w:ilvl w:val="0"/>
+          <w:numId w:val="20"/>
+        </w:numPr>
+        <w:spacing w:after="60"/>
+      </w:pPr>
+      <w:r>
+        <w:rPr>
+          <w:rFonts w:ascii="Arial" w:hAnsi="Arial" w:eastAsia="Arial"/>
+          <w:b w:val="0"/>
+          <w:i w:val="0"/>
+          <w:sz w:val="22"/>
+        </w:rPr>
+        <w:t>Chọn Xem Chi Tiết Hóa Đơn.</w:t>
       </w:r>
     </w:p>
     <w:p>
@@ -5972,7 +6089,7 @@
               <a:graphicData uri="http://schemas.openxmlformats.org/drawingml/2006/picture">
                 <pic:pic>
                   <pic:nvPicPr>
-                    <pic:cNvPr id="0" name="10_hoa_don_chon_san_pham.png"/>
+                    <pic:cNvPr id="0" name="11_hoa_don_chi_tiet.png"/>
                     <pic:cNvPicPr/>
                   </pic:nvPicPr>
                   <pic:blipFill>
@@ -6008,7 +6125,7 @@
           <w:color w:val="374151"/>
           <w:sz w:val="20"/>
         </w:rPr>
-        <w:t>Hình 4.10. Dialog tìm kiếm và chọn sản phẩm</w:t>
+        <w:t>Hình 4.10. Dialog xem chi tiết hóa đơn</w:t>
       </w:r>
     </w:p>
     <w:p>
@@ -6028,143 +6145,7 @@
           <w:color w:val="1F4D78"/>
           <w:sz w:val="26"/>
         </w:rPr>
-        <w:t>4.11. Xem chi tiết hóa đơn</w:t>
-      </w:r>
-    </w:p>
-    <w:p>
-      <w:pPr>
-        <w:spacing w:line="300" w:lineRule="auto" w:after="120"/>
-        <w:jc w:val="both"/>
-      </w:pPr>
-      <w:r>
-        <w:rPr>
-          <w:rFonts w:ascii="Arial" w:hAnsi="Arial" w:eastAsia="Arial"/>
-          <w:b w:val="0"/>
-          <w:i w:val="0"/>
-          <w:sz w:val="22"/>
-        </w:rPr>
-        <w:t>Chi tiết hóa đơn hiển thị thông tin khách hàng, ngày tạo, danh sách sản phẩm, số lượng, đơn giá, thành tiền và tổng tiền.</w:t>
-      </w:r>
-    </w:p>
-    <w:p>
-      <w:pPr>
-        <w:pStyle w:val="ListNumber"/>
-        <w:spacing w:after="60"/>
-      </w:pPr>
-      <w:r>
-        <w:rPr>
-          <w:rFonts w:ascii="Arial" w:hAnsi="Arial" w:eastAsia="Arial"/>
-          <w:b w:val="0"/>
-          <w:i w:val="0"/>
-          <w:sz w:val="22"/>
-        </w:rPr>
-        <w:t>Chọn hóa đơn trong danh sách.</w:t>
-      </w:r>
-    </w:p>
-    <w:p>
-      <w:pPr>
-        <w:pStyle w:val="ListNumber"/>
-        <w:spacing w:after="60"/>
-      </w:pPr>
-      <w:r>
-        <w:rPr>
-          <w:rFonts w:ascii="Arial" w:hAnsi="Arial" w:eastAsia="Arial"/>
-          <w:b w:val="0"/>
-          <w:i w:val="0"/>
-          <w:sz w:val="22"/>
-        </w:rPr>
-        <w:t>Mở menu thao tác.</w:t>
-      </w:r>
-    </w:p>
-    <w:p>
-      <w:pPr>
-        <w:pStyle w:val="ListNumber"/>
-        <w:spacing w:after="60"/>
-      </w:pPr>
-      <w:r>
-        <w:rPr>
-          <w:rFonts w:ascii="Arial" w:hAnsi="Arial" w:eastAsia="Arial"/>
-          <w:b w:val="0"/>
-          <w:i w:val="0"/>
-          <w:sz w:val="22"/>
-        </w:rPr>
-        <w:t>Chọn Xem Chi Tiết Hóa Đơn.</w:t>
-      </w:r>
-    </w:p>
-    <w:p>
-      <w:pPr>
-        <w:keepNext/>
-        <w:jc w:val="center"/>
-      </w:pPr>
-      <w:r>
-        <w:drawing>
-          <wp:inline xmlns:a="http://schemas.openxmlformats.org/drawingml/2006/main" xmlns:pic="http://schemas.openxmlformats.org/drawingml/2006/picture">
-            <wp:extent cx="5989320" cy="3851833"/>
-            <wp:docPr id="11" name="Picture 11"/>
-            <wp:cNvGraphicFramePr>
-              <a:graphicFrameLocks noChangeAspect="1"/>
-            </wp:cNvGraphicFramePr>
-            <a:graphic>
-              <a:graphicData uri="http://schemas.openxmlformats.org/drawingml/2006/picture">
-                <pic:pic>
-                  <pic:nvPicPr>
-                    <pic:cNvPr id="0" name="11_hoa_don_chi_tiet.png"/>
-                    <pic:cNvPicPr/>
-                  </pic:nvPicPr>
-                  <pic:blipFill>
-                    <a:blip r:embed="rId19"/>
-                    <a:stretch>
-                      <a:fillRect/>
-                    </a:stretch>
-                  </pic:blipFill>
-                  <pic:spPr>
-                    <a:xfrm>
-                      <a:off x="0" y="0"/>
-                      <a:ext cx="5989320" cy="3851833"/>
-                    </a:xfrm>
-                    <a:prstGeom prst="rect"/>
-                  </pic:spPr>
-                </pic:pic>
-              </a:graphicData>
-            </a:graphic>
-          </wp:inline>
-        </w:drawing>
-      </w:r>
-    </w:p>
-    <w:p>
-      <w:pPr>
-        <w:spacing w:before="40" w:after="160"/>
-        <w:jc w:val="center"/>
-      </w:pPr>
-      <w:r>
-        <w:rPr>
-          <w:rFonts w:ascii="Arial" w:hAnsi="Arial" w:eastAsia="Arial"/>
-          <w:b w:val="0"/>
-          <w:i/>
-          <w:color w:val="374151"/>
-          <w:sz w:val="20"/>
-        </w:rPr>
-        <w:t>Hình 4.11. Dialog xem chi tiết hóa đơn</w:t>
-      </w:r>
-    </w:p>
-    <w:p>
-      <w:r>
-        <w:br w:type="page"/>
-      </w:r>
-    </w:p>
-    <w:p>
-      <w:pPr>
-        <w:pStyle w:val="Heading2"/>
-      </w:pPr>
-      <w:r>
-        <w:rPr>
-          <w:rFonts w:ascii="Arial" w:hAnsi="Arial" w:eastAsia="Arial"/>
-          <w:b/>
-          <w:i w:val="0"/>
-          <w:color w:val="1F4D78"/>
-          <w:sz w:val="26"/>
-        </w:rPr>
-        <w:t>4.12. Menu thao tác hóa đơn</w:t>
+        <w:t>4.11. Menu thao tác hóa đơn</w:t>
       </w:r>
     </w:p>
     <w:p>
@@ -6184,7 +6165,10 @@
     </w:p>
     <w:p>
       <w:pPr>
-        <w:pStyle w:val="ListNumber"/>
+        <w:numPr>
+          <w:ilvl w:val="0"/>
+          <w:numId w:val="21"/>
+        </w:numPr>
         <w:spacing w:after="60"/>
       </w:pPr>
       <w:r>
@@ -6199,7 +6183,10 @@
     </w:p>
     <w:p>
       <w:pPr>
-        <w:pStyle w:val="ListNumber"/>
+        <w:numPr>
+          <w:ilvl w:val="0"/>
+          <w:numId w:val="21"/>
+        </w:numPr>
         <w:spacing w:after="60"/>
       </w:pPr>
       <w:r>
@@ -6214,7 +6201,10 @@
     </w:p>
     <w:p>
       <w:pPr>
-        <w:pStyle w:val="ListNumber"/>
+        <w:numPr>
+          <w:ilvl w:val="0"/>
+          <w:numId w:val="21"/>
+        </w:numPr>
         <w:spacing w:after="60"/>
       </w:pPr>
       <w:r>
@@ -6236,7 +6226,7 @@
         <w:drawing>
           <wp:inline xmlns:a="http://schemas.openxmlformats.org/drawingml/2006/main" xmlns:pic="http://schemas.openxmlformats.org/drawingml/2006/picture">
             <wp:extent cx="5989320" cy="3743325"/>
-            <wp:docPr id="12" name="Picture 12"/>
+            <wp:docPr id="11" name="Picture 11"/>
             <wp:cNvGraphicFramePr>
               <a:graphicFrameLocks noChangeAspect="1"/>
             </wp:cNvGraphicFramePr>
@@ -6248,7 +6238,7 @@
                     <pic:cNvPicPr/>
                   </pic:nvPicPr>
                   <pic:blipFill>
-                    <a:blip r:embed="rId20"/>
+                    <a:blip r:embed="rId19"/>
                     <a:stretch>
                       <a:fillRect/>
                     </a:stretch>
@@ -6280,7 +6270,7 @@
           <w:color w:val="374151"/>
           <w:sz w:val="20"/>
         </w:rPr>
-        <w:t>Hình 4.12. Menu thao tác hóa đơn</w:t>
+        <w:t>Hình 4.11. Menu thao tác hóa đơn</w:t>
       </w:r>
     </w:p>
     <w:p>
@@ -6300,7 +6290,7 @@
           <w:color w:val="1F4D78"/>
           <w:sz w:val="26"/>
         </w:rPr>
-        <w:t>4.13. Thống kê doanh thu</w:t>
+        <w:t>4.12. Thống kê doanh thu</w:t>
       </w:r>
     </w:p>
     <w:p>
@@ -6320,7 +6310,10 @@
     </w:p>
     <w:p>
       <w:pPr>
-        <w:pStyle w:val="ListNumber"/>
+        <w:numPr>
+          <w:ilvl w:val="0"/>
+          <w:numId w:val="22"/>
+        </w:numPr>
         <w:spacing w:after="60"/>
       </w:pPr>
       <w:r>
@@ -6335,7 +6328,10 @@
     </w:p>
     <w:p>
       <w:pPr>
-        <w:pStyle w:val="ListNumber"/>
+        <w:numPr>
+          <w:ilvl w:val="0"/>
+          <w:numId w:val="22"/>
+        </w:numPr>
         <w:spacing w:after="60"/>
       </w:pPr>
       <w:r>
@@ -6350,7 +6346,10 @@
     </w:p>
     <w:p>
       <w:pPr>
-        <w:pStyle w:val="ListNumber"/>
+        <w:numPr>
+          <w:ilvl w:val="0"/>
+          <w:numId w:val="22"/>
+        </w:numPr>
         <w:spacing w:after="60"/>
       </w:pPr>
       <w:r>
@@ -6365,7 +6364,10 @@
     </w:p>
     <w:p>
       <w:pPr>
-        <w:pStyle w:val="ListNumber"/>
+        <w:numPr>
+          <w:ilvl w:val="0"/>
+          <w:numId w:val="22"/>
+        </w:numPr>
         <w:spacing w:after="60"/>
       </w:pPr>
       <w:r>
@@ -6387,7 +6389,7 @@
         <w:drawing>
           <wp:inline xmlns:a="http://schemas.openxmlformats.org/drawingml/2006/main" xmlns:pic="http://schemas.openxmlformats.org/drawingml/2006/picture">
             <wp:extent cx="5989320" cy="3421876"/>
-            <wp:docPr id="13" name="Picture 13"/>
+            <wp:docPr id="12" name="Picture 12"/>
             <wp:cNvGraphicFramePr>
               <a:graphicFrameLocks noChangeAspect="1"/>
             </wp:cNvGraphicFramePr>
@@ -6399,7 +6401,7 @@
                     <pic:cNvPicPr/>
                   </pic:nvPicPr>
                   <pic:blipFill>
-                    <a:blip r:embed="rId21"/>
+                    <a:blip r:embed="rId20"/>
                     <a:stretch>
                       <a:fillRect/>
                     </a:stretch>
@@ -6431,7 +6433,7 @@
           <w:color w:val="374151"/>
           <w:sz w:val="20"/>
         </w:rPr>
-        <w:t>Hình 4.13. Màn hình thống kê doanh thu</w:t>
+        <w:t>Hình 4.12. Màn hình thống kê doanh thu</w:t>
       </w:r>
     </w:p>
     <w:p>
@@ -6451,7 +6453,7 @@
           <w:color w:val="1F4D78"/>
           <w:sz w:val="26"/>
         </w:rPr>
-        <w:t>4.14. Hóa đơn liên quan trong thống kê</w:t>
+        <w:t>4.13. Hóa đơn liên quan trong thống kê</w:t>
       </w:r>
     </w:p>
     <w:p>
@@ -6471,7 +6473,10 @@
     </w:p>
     <w:p>
       <w:pPr>
-        <w:pStyle w:val="ListNumber"/>
+        <w:numPr>
+          <w:ilvl w:val="0"/>
+          <w:numId w:val="23"/>
+        </w:numPr>
         <w:spacing w:after="60"/>
       </w:pPr>
       <w:r>
@@ -6486,7 +6491,10 @@
     </w:p>
     <w:p>
       <w:pPr>
-        <w:pStyle w:val="ListNumber"/>
+        <w:numPr>
+          <w:ilvl w:val="0"/>
+          <w:numId w:val="23"/>
+        </w:numPr>
         <w:spacing w:after="60"/>
       </w:pPr>
       <w:r>
@@ -6501,7 +6509,10 @@
     </w:p>
     <w:p>
       <w:pPr>
-        <w:pStyle w:val="ListNumber"/>
+        <w:numPr>
+          <w:ilvl w:val="0"/>
+          <w:numId w:val="23"/>
+        </w:numPr>
         <w:spacing w:after="60"/>
       </w:pPr>
       <w:r>
@@ -6523,7 +6534,7 @@
         <w:drawing>
           <wp:inline xmlns:a="http://schemas.openxmlformats.org/drawingml/2006/main" xmlns:pic="http://schemas.openxmlformats.org/drawingml/2006/picture">
             <wp:extent cx="5989320" cy="3839308"/>
-            <wp:docPr id="14" name="Picture 14"/>
+            <wp:docPr id="13" name="Picture 13"/>
             <wp:cNvGraphicFramePr>
               <a:graphicFrameLocks noChangeAspect="1"/>
             </wp:cNvGraphicFramePr>
@@ -6535,7 +6546,7 @@
                     <pic:cNvPicPr/>
                   </pic:nvPicPr>
                   <pic:blipFill>
-                    <a:blip r:embed="rId22"/>
+                    <a:blip r:embed="rId21"/>
                     <a:stretch>
                       <a:fillRect/>
                     </a:stretch>
@@ -6567,7 +6578,7 @@
           <w:color w:val="374151"/>
           <w:sz w:val="20"/>
         </w:rPr>
-        <w:t>Hình 4.14. Danh sách hóa đơn liên quan</w:t>
+        <w:t>Hình 4.13. Danh sách hóa đơn liên quan</w:t>
       </w:r>
     </w:p>
     <w:p>
@@ -6629,7 +6640,7 @@
         <w:drawing>
           <wp:inline xmlns:a="http://schemas.openxmlformats.org/drawingml/2006/main" xmlns:pic="http://schemas.openxmlformats.org/drawingml/2006/picture">
             <wp:extent cx="6172200" cy="5887092"/>
-            <wp:docPr id="15" name="Picture 15"/>
+            <wp:docPr id="14" name="Picture 14"/>
             <wp:cNvGraphicFramePr>
               <a:graphicFrameLocks noChangeAspect="1"/>
             </wp:cNvGraphicFramePr>
@@ -6641,7 +6652,7 @@
                     <pic:cNvPicPr/>
                   </pic:nvPicPr>
                   <pic:blipFill>
-                    <a:blip r:embed="rId23"/>
+                    <a:blip r:embed="rId22"/>
                     <a:stretch>
                       <a:fillRect/>
                     </a:stretch>
@@ -6690,7 +6701,7 @@
         <w:drawing>
           <wp:inline xmlns:a="http://schemas.openxmlformats.org/drawingml/2006/main" xmlns:pic="http://schemas.openxmlformats.org/drawingml/2006/picture">
             <wp:extent cx="6172200" cy="3270278"/>
-            <wp:docPr id="16" name="Picture 16"/>
+            <wp:docPr id="15" name="Picture 15"/>
             <wp:cNvGraphicFramePr>
               <a:graphicFrameLocks noChangeAspect="1"/>
             </wp:cNvGraphicFramePr>
@@ -6702,7 +6713,7 @@
                     <pic:cNvPicPr/>
                   </pic:nvPicPr>
                   <pic:blipFill>
-                    <a:blip r:embed="rId24"/>
+                    <a:blip r:embed="rId23"/>
                     <a:stretch>
                       <a:fillRect/>
                     </a:stretch>
@@ -6751,7 +6762,7 @@
         <w:drawing>
           <wp:inline xmlns:a="http://schemas.openxmlformats.org/drawingml/2006/main" xmlns:pic="http://schemas.openxmlformats.org/drawingml/2006/picture">
             <wp:extent cx="6172200" cy="3744930"/>
-            <wp:docPr id="17" name="Picture 17"/>
+            <wp:docPr id="16" name="Picture 16"/>
             <wp:cNvGraphicFramePr>
               <a:graphicFrameLocks noChangeAspect="1"/>
             </wp:cNvGraphicFramePr>
@@ -6763,7 +6774,7 @@
                     <pic:cNvPicPr/>
                   </pic:nvPicPr>
                   <pic:blipFill>
-                    <a:blip r:embed="rId25"/>
+                    <a:blip r:embed="rId24"/>
                     <a:stretch>
                       <a:fillRect/>
                     </a:stretch>
@@ -6812,7 +6823,7 @@
         <w:drawing>
           <wp:inline xmlns:a="http://schemas.openxmlformats.org/drawingml/2006/main" xmlns:pic="http://schemas.openxmlformats.org/drawingml/2006/picture">
             <wp:extent cx="6172200" cy="7509332"/>
-            <wp:docPr id="18" name="Picture 18"/>
+            <wp:docPr id="17" name="Picture 17"/>
             <wp:cNvGraphicFramePr>
               <a:graphicFrameLocks noChangeAspect="1"/>
             </wp:cNvGraphicFramePr>
@@ -6824,7 +6835,7 @@
                     <pic:cNvPicPr/>
                   </pic:nvPicPr>
                   <pic:blipFill>
-                    <a:blip r:embed="rId26"/>
+                    <a:blip r:embed="rId25"/>
                     <a:stretch>
                       <a:fillRect/>
                     </a:stretch>
@@ -6873,7 +6884,7 @@
         <w:drawing>
           <wp:inline xmlns:a="http://schemas.openxmlformats.org/drawingml/2006/main" xmlns:pic="http://schemas.openxmlformats.org/drawingml/2006/picture">
             <wp:extent cx="6172200" cy="9236869"/>
-            <wp:docPr id="19" name="Picture 19"/>
+            <wp:docPr id="18" name="Picture 18"/>
             <wp:cNvGraphicFramePr>
               <a:graphicFrameLocks noChangeAspect="1"/>
             </wp:cNvGraphicFramePr>
@@ -6885,7 +6896,7 @@
                     <pic:cNvPicPr/>
                   </pic:nvPicPr>
                   <pic:blipFill>
-                    <a:blip r:embed="rId27"/>
+                    <a:blip r:embed="rId26"/>
                     <a:stretch>
                       <a:fillRect/>
                     </a:stretch>
@@ -7433,6 +7444,48 @@
     <w:abstractNumId w:val="1"/>
   </w:num>
   <w:num w:numId="9">
+    <w:abstractNumId w:val="0"/>
+  </w:num>
+  <w:num w:numId="10">
+    <w:abstractNumId w:val="0"/>
+  </w:num>
+  <w:num w:numId="11">
+    <w:abstractNumId w:val="0"/>
+  </w:num>
+  <w:num w:numId="12">
+    <w:abstractNumId w:val="0"/>
+  </w:num>
+  <w:num w:numId="13">
+    <w:abstractNumId w:val="0"/>
+  </w:num>
+  <w:num w:numId="14">
+    <w:abstractNumId w:val="0"/>
+  </w:num>
+  <w:num w:numId="15">
+    <w:abstractNumId w:val="0"/>
+  </w:num>
+  <w:num w:numId="16">
+    <w:abstractNumId w:val="0"/>
+  </w:num>
+  <w:num w:numId="17">
+    <w:abstractNumId w:val="0"/>
+  </w:num>
+  <w:num w:numId="18">
+    <w:abstractNumId w:val="0"/>
+  </w:num>
+  <w:num w:numId="19">
+    <w:abstractNumId w:val="0"/>
+  </w:num>
+  <w:num w:numId="20">
+    <w:abstractNumId w:val="0"/>
+  </w:num>
+  <w:num w:numId="21">
+    <w:abstractNumId w:val="0"/>
+  </w:num>
+  <w:num w:numId="22">
+    <w:abstractNumId w:val="0"/>
+  </w:num>
+  <w:num w:numId="23">
     <w:abstractNumId w:val="0"/>
   </w:num>
 </w:numbering>

</xml_diff>